<commit_message>
Reposition report around digital custody and procurement workflow; end date Dec 17
Co-Authored-By: Claude Sonnet 5.5 <noreply@anthropic.com>
Claude-Session: https://claude.ai/code/session_01T9VtmMcFMJF9ADU8Ks4Xou
</commit_message>
<xml_diff>
--- a/reporte/Reporte_Preliminar_Skyworks_CORREGIDO.docx
+++ b/reporte/Reporte_Preliminar_Skyworks_CORREGIDO.docx
@@ -868,7 +868,7 @@
           <w:sz w:val="24"/>
           <w:u w:val="single"/>
         </w:rPr>
-        <w:t>12</w:t>
+        <w:t>17</w:t>
       </w:r>
       <w:r>
         <w:rPr>
@@ -939,7 +939,7 @@
           <w:rFonts w:ascii="Calibri Light" w:eastAsia="Cambria" w:hAnsi="Calibri Light" w:cs="Calibri Light"/>
           <w:sz w:val="24"/>
         </w:rPr>
-        <w:t xml:space="preserve">Sistema web de gestión de activos y aprovisionamiento de equipos de TI</w:t>
+        <w:t xml:space="preserve">Plataforma web de resguardo digital y seguimiento del aprovisionamiento de equipos de TI</w:t>
       </w:r>
     </w:p>
     <w:p>
@@ -976,7 +976,7 @@
           <w:rFonts w:ascii="Calibri Light" w:eastAsia="Cambria" w:hAnsi="Calibri Light" w:cs="Calibri Light"/>
           <w:sz w:val="24"/>
         </w:rPr>
-        <w:t xml:space="preserve">Desarrollar una aplicación web que digitalice la gestión del inventario, el resguardo de telefonía móvil y el seguimiento del aprovisionamiento de equipos del Departamento de Tecnologías de la Información.</w:t>
+        <w:t xml:space="preserve">Desarrollar una plataforma web que digitalice el resguardo de telefonía móvil con evidencia electrónica y permita dar seguimiento y medir los tiempos del proceso de aprovisionamiento de equipos del Departamento de Tecnologías de la Información.</w:t>
       </w:r>
     </w:p>
     <w:p>
@@ -1051,7 +1051,7 @@
           <w:sz w:val="24"/>
         </w:rPr>
         <w:br/>
-        <w:t xml:space="preserve">1. Analizar los procesos del Departamento de TI y diseñar la arquitectura de la aplicación (API REST y base de datos MySQL).</w:t>
+        <w:t xml:space="preserve">1. Analizar los procesos de resguardo de telefonía y de aprovisionamiento de equipos, y diseñar la arquitectura de la plataforma (API REST y base de datos MySQL).</w:t>
       </w:r>
       <w:r>
         <w:rPr>
@@ -1059,7 +1059,7 @@
           <w:sz w:val="24"/>
         </w:rPr>
         <w:br/>
-        <w:t xml:space="preserve">2. Desarrollar los módulos de inventario de equipos y de telefonía móvil con firma digital y foto de evidencia, con acceso controlado por roles de usuario.</w:t>
+        <w:t xml:space="preserve">2. Desarrollar el módulo de resguardo digital de telefonía móvil con firma electrónica, foto de evidencia, comprobante y consulta por empleado.</w:t>
       </w:r>
       <w:r>
         <w:rPr>
@@ -1067,7 +1067,7 @@
           <w:sz w:val="24"/>
         </w:rPr>
         <w:br/>
-        <w:t xml:space="preserve">3. Desarrollar el módulo de aprovisionamiento de equipos (11 etapas, con historial de cambios) y un tablero de indicadores de desempeño.</w:t>
+        <w:t xml:space="preserve">3. Desarrollar el motor de flujo de aprovisionamiento de 11 etapas, con bitácora de cambios y tablero que mida el tiempo por etapa, el cuello de botella y el cumplimiento de la meta de servicio.</w:t>
       </w:r>
       <w:r>
         <w:rPr>
@@ -1075,7 +1075,7 @@
           <w:sz w:val="24"/>
         </w:rPr>
         <w:br/>
-        <w:t xml:space="preserve">4. Realizar las pruebas, el despliegue y la documentación de la aplicación.</w:t>
+        <w:t xml:space="preserve">4. Implementar la autenticación con roles de usuario y realizar las pruebas, el despliegue y la documentación.</w:t>
       </w:r>
     </w:p>
     <w:p>
@@ -1112,7 +1112,7 @@
           <w:rFonts w:ascii="Calibri Light" w:eastAsia="Cambria" w:hAnsi="Calibri Light" w:cs="Calibri Light"/>
           <w:sz w:val="24"/>
         </w:rPr>
-        <w:t xml:space="preserve">En el Departamento de TI de Skyworks el inventario se llevaba únicamente como un conteo de existencias, y otros procesos se realizaban de forma manual: el resguardo de teléfonos móviles se documentaba en papel y el avance de las solicitudes de equipo no tenía trazabilidad ni medición de tiempos. Este proyecto desarrolla una aplicación web propia, con código original, que sustituye ese conteo por un sistema con interfaz web, API REST (Node.js y Express), base de datos relacional MySQL, autenticación con roles de usuario y módulos de telefonía móvil, aprovisionamiento y estadísticas. Con ello se elimina el uso de papel, se obtiene trazabilidad de cada equipo y solicitud, y se cuenta con indicadores para la toma de decisiones del área.</w:t>
+        <w:t xml:space="preserve">A diferencia de proyectos previos del área, centrados en el conteo de existencias, esta plataforma se enfoca en los procesos del Departamento de TI que hoy se realizan sin trazabilidad. El resguardo de teléfonos móviles se documenta en papel, sin evidencia verificable de quién recibió cada equipo. Las solicitudes de equipo avanzan entre varias áreas a lo largo de 11 etapas, sin visibilidad de su estado ni medición de tiempos, por lo que no se sabe dónde se detienen. Se desarrollará una aplicación web propia (Node.js, Express y MySQL) con código original: un módulo de resguardo con firma electrónica y foto, un motor de flujo con bitácora de cada cambio de etapa y responsable, y un tablero que calcula la permanencia por etapa y el cuello de botella para apoyar la mejora continua. El acceso se controla por roles de usuario y el inventario de equipos se integra como módulo de apoyo.</w:t>
       </w:r>
     </w:p>
     <w:p>
@@ -1453,7 +1453,7 @@
                 <w:rFonts w:ascii="Calibri Light" w:eastAsia="Cambria" w:hAnsi="Calibri Light" w:cs="Calibri Light"/>
                 <w:sz w:val="24"/>
               </w:rPr>
-              <w:t xml:space="preserve">Levantamiento y análisis de los procesos de inventario, telefonía móvil y aprovisionamiento con el personal del Departamento de TI; especificación de requerimientos de la aplicación.</w:t>
+              <w:t xml:space="preserve">Levantamiento de los procesos de resguardo de telefonía y de aprovisionamiento con el personal del Departamento de TI; especificación de requerimientos de la plataforma.</w:t>
             </w:r>
           </w:p>
         </w:tc>
@@ -1499,7 +1499,7 @@
                 <w:rFonts w:ascii="Calibri Light" w:eastAsia="Cambria" w:hAnsi="Calibri Light" w:cs="Calibri Light"/>
                 <w:sz w:val="24"/>
               </w:rPr>
-              <w:t xml:space="preserve">55</w:t>
+              <w:t xml:space="preserve">50</w:t>
             </w:r>
           </w:p>
         </w:tc>
@@ -1671,7 +1671,7 @@
                 <w:rFonts w:ascii="Calibri Light" w:eastAsia="Cambria" w:hAnsi="Calibri Light" w:cs="Calibri Light"/>
                 <w:sz w:val="24"/>
               </w:rPr>
-              <w:t xml:space="preserve">Desarrollo del módulo de telefonía móvil</w:t>
+              <w:t xml:space="preserve">Módulo de resguardo digital de telefonía móvil</w:t>
             </w:r>
           </w:p>
         </w:tc>
@@ -1694,7 +1694,7 @@
                 <w:rFonts w:ascii="Calibri Light" w:eastAsia="Cambria" w:hAnsi="Calibri Light" w:cs="Calibri Light"/>
                 <w:sz w:val="24"/>
               </w:rPr>
-              <w:t xml:space="preserve">Programación del registro de asignación y devolución de teléfonos con captura de firma digital y foto de evidencia, y generación del comprobante de resguardo.</w:t>
+              <w:t xml:space="preserve">Programación del registro de entrega y devolución de teléfonos con firma electrónica, foto de evidencia y comprobante, y de la consulta por empleado.</w:t>
             </w:r>
           </w:p>
         </w:tc>
@@ -1740,7 +1740,7 @@
                 <w:rFonts w:ascii="Calibri Light" w:eastAsia="Cambria" w:hAnsi="Calibri Light" w:cs="Calibri Light"/>
                 <w:sz w:val="24"/>
               </w:rPr>
-              <w:t xml:space="preserve">80</w:t>
+              <w:t xml:space="preserve">90</w:t>
             </w:r>
           </w:p>
         </w:tc>
@@ -1771,7 +1771,7 @@
                 <w:rFonts w:ascii="Calibri Light" w:eastAsia="Cambria" w:hAnsi="Calibri Light" w:cs="Calibri Light"/>
                 <w:sz w:val="24"/>
               </w:rPr>
-              <w:t xml:space="preserve">Desarrollo del módulo de inventario y control de acceso</w:t>
+              <w:t xml:space="preserve">Autenticación, roles de usuario y módulo de inventario</w:t>
             </w:r>
           </w:p>
         </w:tc>
@@ -1785,7 +1785,7 @@
                 <w:rFonts w:ascii="Calibri Light" w:eastAsia="Cambria" w:hAnsi="Calibri Light" w:cs="Calibri Light"/>
                 <w:sz w:val="24"/>
               </w:rPr>
-              <w:t xml:space="preserve">Programación del inventario de equipos y de la autenticación con roles de usuario (administrador, técnico, entrega y consulta).</w:t>
+              <w:t xml:space="preserve">Programación del inicio de sesión seguro, la recuperación de contraseña por correo, los roles (administrador, técnico, entrega y consulta) y el inventario de equipos de apoyo.</w:t>
             </w:r>
           </w:p>
         </w:tc>
@@ -1799,7 +1799,7 @@
                 <w:rFonts w:ascii="Calibri Light" w:eastAsia="Cambria" w:hAnsi="Calibri Light" w:cs="Calibri Light"/>
                 <w:sz w:val="24"/>
               </w:rPr>
-              <w:t xml:space="preserve">Semana 8</w:t>
+              <w:t xml:space="preserve">Semana 8 a 9</w:t>
             </w:r>
           </w:p>
         </w:tc>
@@ -1813,7 +1813,7 @@
                 <w:rFonts w:ascii="Calibri Light" w:eastAsia="Cambria" w:hAnsi="Calibri Light" w:cs="Calibri Light"/>
                 <w:sz w:val="24"/>
               </w:rPr>
-              <w:t xml:space="preserve">45</w:t>
+              <w:t xml:space="preserve">60</w:t>
             </w:r>
           </w:p>
         </w:tc>
@@ -1843,7 +1843,7 @@
                 <w:rFonts w:ascii="Calibri Light" w:eastAsia="Cambria" w:hAnsi="Calibri Light" w:cs="Calibri Light"/>
                 <w:sz w:val="24"/>
               </w:rPr>
-              <w:t xml:space="preserve">Desarrollo del módulo de aprovisionamiento (back-end)</w:t>
+              <w:t xml:space="preserve">Motor de flujo de aprovisionamiento (API)</w:t>
             </w:r>
           </w:p>
         </w:tc>
@@ -1857,7 +1857,7 @@
                 <w:rFonts w:ascii="Calibri Light" w:eastAsia="Cambria" w:hAnsi="Calibri Light" w:cs="Calibri Light"/>
                 <w:sz w:val="24"/>
               </w:rPr>
-              <w:t xml:space="preserve">Programación de la API del flujo de 11 etapas, desde Ticket Created hasta Delivery, con historial de cambios de estado y responsables.</w:t>
+              <w:t xml:space="preserve">Programación de la API del flujo de 11 etapas, desde Ticket Created hasta Delivery, con validación de transiciones y bitácora de cambios y responsables.</w:t>
             </w:r>
           </w:p>
         </w:tc>
@@ -1871,7 +1871,7 @@
                 <w:rFonts w:ascii="Calibri Light" w:eastAsia="Cambria" w:hAnsi="Calibri Light" w:cs="Calibri Light"/>
                 <w:sz w:val="24"/>
               </w:rPr>
-              <w:t xml:space="preserve">Semana 9 a 10</w:t>
+              <w:t xml:space="preserve">Semana 10 a 11</w:t>
             </w:r>
           </w:p>
         </w:tc>
@@ -1885,7 +1885,7 @@
                 <w:rFonts w:ascii="Calibri Light" w:eastAsia="Cambria" w:hAnsi="Calibri Light" w:cs="Calibri Light"/>
                 <w:sz w:val="24"/>
               </w:rPr>
-              <w:t xml:space="preserve">55</w:t>
+              <w:t xml:space="preserve">60</w:t>
             </w:r>
           </w:p>
         </w:tc>
@@ -1915,7 +1915,7 @@
                 <w:rFonts w:ascii="Calibri Light" w:eastAsia="Cambria" w:hAnsi="Calibri Light" w:cs="Calibri Light"/>
                 <w:sz w:val="24"/>
               </w:rPr>
-              <w:t xml:space="preserve">Desarrollo de la interfaz del flujo de aprovisionamiento</w:t>
+              <w:t xml:space="preserve">Interfaz del flujo de aprovisionamiento</w:t>
             </w:r>
           </w:p>
         </w:tc>
@@ -1929,7 +1929,7 @@
                 <w:rFonts w:ascii="Calibri Light" w:eastAsia="Cambria" w:hAnsi="Calibri Light" w:cs="Calibri Light"/>
                 <w:sz w:val="24"/>
               </w:rPr>
-              <w:t xml:space="preserve">Programación de la interfaz web para crear, consultar y avanzar solicitudes a través de las etapas del flujo.</w:t>
+              <w:t xml:space="preserve">Programación de la interfaz web para crear, consultar, avanzar y cancelar solicitudes a través de las etapas del flujo.</w:t>
             </w:r>
           </w:p>
         </w:tc>
@@ -1943,7 +1943,7 @@
                 <w:rFonts w:ascii="Calibri Light" w:eastAsia="Cambria" w:hAnsi="Calibri Light" w:cs="Calibri Light"/>
                 <w:sz w:val="24"/>
               </w:rPr>
-              <w:t xml:space="preserve">Semana 11 a 13</w:t>
+              <w:t xml:space="preserve">Semana 12 a 13</w:t>
             </w:r>
           </w:p>
         </w:tc>
@@ -1957,7 +1957,7 @@
                 <w:rFonts w:ascii="Calibri Light" w:eastAsia="Cambria" w:hAnsi="Calibri Light" w:cs="Calibri Light"/>
                 <w:sz w:val="24"/>
               </w:rPr>
-              <w:t xml:space="preserve">90</w:t>
+              <w:t xml:space="preserve">75</w:t>
             </w:r>
           </w:p>
         </w:tc>
@@ -1987,7 +1987,7 @@
                 <w:rFonts w:ascii="Calibri Light" w:eastAsia="Cambria" w:hAnsi="Calibri Light" w:cs="Calibri Light"/>
                 <w:sz w:val="24"/>
               </w:rPr>
-              <w:t xml:space="preserve">Desarrollo del tablero de indicadores</w:t>
+              <w:t xml:space="preserve">Tablero de indicadores de tiempo</w:t>
             </w:r>
           </w:p>
         </w:tc>
@@ -2001,7 +2001,7 @@
                 <w:rFonts w:ascii="Calibri Light" w:eastAsia="Cambria" w:hAnsi="Calibri Light" w:cs="Calibri Light"/>
                 <w:sz w:val="24"/>
               </w:rPr>
-              <w:t xml:space="preserve">Programación del tablero con tiempo por etapa, tiempo total de entrega y cuello de botella, para identificar áreas de mejora.</w:t>
+              <w:t xml:space="preserve">Programación del tablero con permanencia por etapa, tiempo total de entrega, cuello de botella y porcentaje de cumplimiento de la meta, con exportación de datos.</w:t>
             </w:r>
           </w:p>
         </w:tc>
@@ -2101,7 +2101,7 @@
                 <w:rFonts w:ascii="Calibri Light" w:eastAsia="Cambria" w:hAnsi="Calibri Light" w:cs="Calibri Light"/>
                 <w:sz w:val="24"/>
               </w:rPr>
-              <w:t xml:space="preserve">80</w:t>
+              <w:t xml:space="preserve">70</w:t>
             </w:r>
           </w:p>
         </w:tc>

</xml_diff>

<commit_message>
Add stage-overdue email alerts for the provisioning pipeline; update report
Co-Authored-By: Claude Sonnet 5.5 <noreply@anthropic.com>
Claude-Session: https://claude.ai/code/session_01T9VtmMcFMJF9ADU8Ks4Xou
</commit_message>
<xml_diff>
--- a/reporte/Reporte_Preliminar_Skyworks_CORREGIDO.docx
+++ b/reporte/Reporte_Preliminar_Skyworks_CORREGIDO.docx
@@ -1067,7 +1067,7 @@
           <w:sz w:val="24"/>
         </w:rPr>
         <w:br/>
-        <w:t xml:space="preserve">3. Desarrollar el motor de flujo de aprovisionamiento de 11 etapas, con bitácora de cambios y tablero que mida el tiempo por etapa, el cuello de botella y el cumplimiento de la meta de servicio.</w:t>
+        <w:t xml:space="preserve">3. Desarrollar el motor de flujo de aprovisionamiento de 11 etapas, con bitácora de cambios, un tablero que mida el tiempo por etapa y el cuello de botella, y alertas automáticas por correo cuando una solicitud excede el tiempo límite de su etapa.</w:t>
       </w:r>
       <w:r>
         <w:rPr>
@@ -1112,7 +1112,7 @@
           <w:rFonts w:ascii="Calibri Light" w:eastAsia="Cambria" w:hAnsi="Calibri Light" w:cs="Calibri Light"/>
           <w:sz w:val="24"/>
         </w:rPr>
-        <w:t xml:space="preserve">A diferencia de proyectos previos del área, centrados en el conteo de existencias, esta plataforma se enfoca en los procesos del Departamento de TI que hoy se realizan sin trazabilidad. El resguardo de teléfonos móviles se documenta en papel, sin evidencia verificable de quién recibió cada equipo. Las solicitudes de equipo avanzan entre varias áreas a lo largo de 11 etapas, sin visibilidad de su estado ni medición de tiempos, por lo que no se sabe dónde se detienen. Se desarrollará una aplicación web propia (Node.js, Express y MySQL) con código original: un módulo de resguardo con firma electrónica y foto, un motor de flujo con bitácora de cada cambio de etapa y responsable, y un tablero que calcula la permanencia por etapa y el cuello de botella para apoyar la mejora continua. El acceso se controla por roles de usuario y el inventario de equipos se integra como módulo de apoyo.</w:t>
+        <w:t xml:space="preserve">A diferencia de proyectos previos del área, centrados en el conteo de existencias, esta plataforma se enfoca en los procesos del Departamento de TI que hoy se realizan sin trazabilidad. El resguardo de teléfonos móviles se documenta en papel, sin evidencia verificable de quién recibió cada equipo. Las solicitudes de equipo avanzan entre varias áreas a lo largo de 11 etapas, sin visibilidad de su estado ni medición de tiempos, por lo que no se sabe dónde se detienen. Se desarrollará una aplicación web propia (Node.js, Express y MySQL) con código original: un módulo de resguardo con firma electrónica y foto, un motor de flujo con bitácora de cada cambio de etapa y responsable, un tablero que calcula la permanencia por etapa y el cuello de botella, y un sistema de alertas que avisa por correo al responsable cuando una solicitud se detiene más del tiempo permitido en una etapa, para actuar antes de que se retrase la entrega. El acceso se controla por roles de usuario y el inventario de equipos se integra como módulo de apoyo.</w:t>
       </w:r>
     </w:p>
     <w:p>
@@ -1987,7 +1987,7 @@
                 <w:rFonts w:ascii="Calibri Light" w:eastAsia="Cambria" w:hAnsi="Calibri Light" w:cs="Calibri Light"/>
                 <w:sz w:val="24"/>
               </w:rPr>
-              <w:t xml:space="preserve">Tablero de indicadores de tiempo</w:t>
+              <w:t xml:space="preserve">Tablero de indicadores y alertas por correo</w:t>
             </w:r>
           </w:p>
         </w:tc>
@@ -2001,7 +2001,7 @@
                 <w:rFonts w:ascii="Calibri Light" w:eastAsia="Cambria" w:hAnsi="Calibri Light" w:cs="Calibri Light"/>
                 <w:sz w:val="24"/>
               </w:rPr>
-              <w:t xml:space="preserve">Programación del tablero con permanencia por etapa, tiempo total de entrega, cuello de botella y porcentaje de cumplimiento de la meta, con exportación de datos.</w:t>
+              <w:t xml:space="preserve">Programación del tablero (permanencia por etapa, tiempo total de entrega, cuello de botella) y del servicio que revisa periódicamente las solicitudes y envía alertas por correo al responsable cuando exceden el tiempo límite de su etapa.</w:t>
             </w:r>
           </w:p>
         </w:tc>
@@ -2029,7 +2029,7 @@
                 <w:rFonts w:ascii="Calibri Light" w:eastAsia="Cambria" w:hAnsi="Calibri Light" w:cs="Calibri Light"/>
                 <w:sz w:val="24"/>
               </w:rPr>
-              <w:t xml:space="preserve">40</w:t>
+              <w:t xml:space="preserve">50</w:t>
             </w:r>
           </w:p>
         </w:tc>
@@ -2101,7 +2101,7 @@
                 <w:rFonts w:ascii="Calibri Light" w:eastAsia="Cambria" w:hAnsi="Calibri Light" w:cs="Calibri Light"/>
                 <w:sz w:val="24"/>
               </w:rPr>
-              <w:t xml:space="preserve">70</w:t>
+              <w:t xml:space="preserve">60</w:t>
             </w:r>
           </w:p>
         </w:tc>

</xml_diff>

<commit_message>
Report: add audit log and per-department dashboard
Co-Authored-By: Claude Sonnet 5.5 <noreply@anthropic.com>
Claude-Session: https://claude.ai/code/session_01T9VtmMcFMJF9ADU8Ks4Xou
</commit_message>
<xml_diff>
--- a/reporte/Reporte_Preliminar_Skyworks_CORREGIDO.docx
+++ b/reporte/Reporte_Preliminar_Skyworks_CORREGIDO.docx
@@ -1067,7 +1067,7 @@
           <w:sz w:val="24"/>
         </w:rPr>
         <w:br/>
-        <w:t xml:space="preserve">3. Desarrollar el motor de flujo de aprovisionamiento de 11 etapas, con bitácora de cambios, un tablero que mida el tiempo por etapa y el cuello de botella, y alertas automáticas por correo cuando una solicitud excede el tiempo límite de su etapa.</w:t>
+        <w:t xml:space="preserve">3. Desarrollar el motor de flujo de aprovisionamiento de 11 etapas, con bitácora de cambios, un tablero que mida el tiempo por etapa y por departamento y el cuello de botella, y alertas automáticas por correo cuando una solicitud excede el tiempo límite de su etapa.</w:t>
       </w:r>
       <w:r>
         <w:rPr>
@@ -1075,7 +1075,7 @@
           <w:sz w:val="24"/>
         </w:rPr>
         <w:br/>
-        <w:t xml:space="preserve">4. Implementar la autenticación con roles de usuario y realizar las pruebas, el despliegue y la documentación.</w:t>
+        <w:t xml:space="preserve">4. Implementar la autenticación con roles de usuario y una bitácora de auditoría de las operaciones, y realizar las pruebas, el despliegue y la documentación.</w:t>
       </w:r>
     </w:p>
     <w:p>
@@ -1112,7 +1112,7 @@
           <w:rFonts w:ascii="Calibri Light" w:eastAsia="Cambria" w:hAnsi="Calibri Light" w:cs="Calibri Light"/>
           <w:sz w:val="24"/>
         </w:rPr>
-        <w:t xml:space="preserve">A diferencia de proyectos previos del área, centrados en el conteo de existencias, esta plataforma se enfoca en los procesos del Departamento de TI que hoy se realizan sin trazabilidad. El resguardo de teléfonos móviles se documenta en papel, sin evidencia verificable de quién recibió cada equipo. Las solicitudes de equipo avanzan entre varias áreas a lo largo de 11 etapas, sin visibilidad de su estado ni medición de tiempos, por lo que no se sabe dónde se detienen. Se desarrollará una aplicación web propia (Node.js, Express y MySQL) con código original: un módulo de resguardo con firma electrónica y foto, un motor de flujo con bitácora de cada cambio de etapa y responsable, un tablero que calcula la permanencia por etapa y el cuello de botella, y un sistema de alertas que avisa por correo al responsable cuando una solicitud se detiene más del tiempo permitido en una etapa, para actuar antes de que se retrase la entrega. El acceso se controla por roles de usuario y el inventario de equipos se integra como módulo de apoyo.</w:t>
+        <w:t xml:space="preserve">A diferencia de proyectos previos del área, centrados en el conteo de existencias, esta plataforma se enfoca en los procesos del Departamento de TI que hoy se realizan sin trazabilidad. El resguardo de teléfonos móviles se documenta en papel, sin evidencia verificable de quién recibió cada equipo. Las solicitudes de equipo avanzan entre varias áreas a lo largo de 11 etapas, sin visibilidad de su estado ni medición de tiempos, por lo que no se sabe dónde se detienen. Se desarrollará una aplicación web propia (Node.js, Express y MySQL) con código original: un módulo de resguardo con firma electrónica y foto, un motor de flujo con bitácora de cada cambio de etapa y responsable, un tablero que calcula la permanencia por etapa y por departamento solicitante y el cuello de botella, y un sistema de alertas que avisa por correo al responsable cuando una solicitud se detiene más del tiempo permitido en una etapa, para actuar antes de que se retrase la entrega. El acceso se controla por roles de usuario y una bitácora de auditoría registra quién crea, modifica o elimina cada registro, para dar trazabilidad y responsabilidad. El inventario de equipos se integra como módulo de apoyo.</w:t>
       </w:r>
     </w:p>
     <w:p>
@@ -1771,7 +1771,7 @@
                 <w:rFonts w:ascii="Calibri Light" w:eastAsia="Cambria" w:hAnsi="Calibri Light" w:cs="Calibri Light"/>
                 <w:sz w:val="24"/>
               </w:rPr>
-              <w:t xml:space="preserve">Autenticación, roles de usuario y módulo de inventario</w:t>
+              <w:t xml:space="preserve">Autenticación, roles, bitácora de auditoría e inventario</w:t>
             </w:r>
           </w:p>
         </w:tc>
@@ -1785,7 +1785,7 @@
                 <w:rFonts w:ascii="Calibri Light" w:eastAsia="Cambria" w:hAnsi="Calibri Light" w:cs="Calibri Light"/>
                 <w:sz w:val="24"/>
               </w:rPr>
-              <w:t xml:space="preserve">Programación del inicio de sesión seguro, la recuperación de contraseña por correo, los roles (administrador, técnico, entrega y consulta) y el inventario de equipos de apoyo.</w:t>
+              <w:t xml:space="preserve">Programación del inicio de sesión seguro, la recuperación de contraseña por correo, los roles (administrador, técnico, entrega y consulta), la bitácora de auditoría de operaciones (quién, qué y cuándo) y el inventario de equipos de apoyo.</w:t>
             </w:r>
           </w:p>
         </w:tc>
@@ -1813,7 +1813,7 @@
                 <w:rFonts w:ascii="Calibri Light" w:eastAsia="Cambria" w:hAnsi="Calibri Light" w:cs="Calibri Light"/>
                 <w:sz w:val="24"/>
               </w:rPr>
-              <w:t xml:space="preserve">60</w:t>
+              <w:t xml:space="preserve">70</w:t>
             </w:r>
           </w:p>
         </w:tc>
@@ -1957,7 +1957,7 @@
                 <w:rFonts w:ascii="Calibri Light" w:eastAsia="Cambria" w:hAnsi="Calibri Light" w:cs="Calibri Light"/>
                 <w:sz w:val="24"/>
               </w:rPr>
-              <w:t xml:space="preserve">75</w:t>
+              <w:t xml:space="preserve">65</w:t>
             </w:r>
           </w:p>
         </w:tc>
@@ -2001,7 +2001,7 @@
                 <w:rFonts w:ascii="Calibri Light" w:eastAsia="Cambria" w:hAnsi="Calibri Light" w:cs="Calibri Light"/>
                 <w:sz w:val="24"/>
               </w:rPr>
-              <w:t xml:space="preserve">Programación del tablero (permanencia por etapa, tiempo total de entrega, cuello de botella) y del servicio que revisa periódicamente las solicitudes y envía alertas por correo al responsable cuando exceden el tiempo límite de su etapa.</w:t>
+              <w:t xml:space="preserve">Programación del tablero (permanencia por etapa y por departamento solicitante, tiempo total de entrega, cuello de botella) y del servicio que revisa periódicamente las solicitudes y envía alertas por correo al responsable cuando exceden el tiempo límite de su etapa.</w:t>
             </w:r>
           </w:p>
         </w:tc>

</xml_diff>